<commit_message>
data updates, speakers are marked with hi rend=speaker elements
</commit_message>
<xml_diff>
--- a/datasource/transcriptions/docx/Aler-Innocentia.docx
+++ b/datasource/transcriptions/docx/Aler-Innocentia.docx
@@ -1,6 +1,6 @@
 
 <file path=word/document.xml><?xml version="1.0" encoding="utf-8"?>
-<w:document xmlns:wpc="http://schemas.microsoft.com/office/word/2010/wordprocessingCanvas" xmlns:cx="http://schemas.microsoft.com/office/drawing/2014/chartex" xmlns:cx1="http://schemas.microsoft.com/office/drawing/2015/9/8/chartex" xmlns:cx2="http://schemas.microsoft.com/office/drawing/2015/10/21/chartex" xmlns:cx3="http://schemas.microsoft.com/office/drawing/2016/5/9/chartex" xmlns:cx4="http://schemas.microsoft.com/office/drawing/2016/5/10/chartex" xmlns:cx5="http://schemas.microsoft.com/office/drawing/2016/5/11/chartex" xmlns:cx6="http://schemas.microsoft.com/office/drawing/2016/5/12/chartex" xmlns:cx7="http://schemas.microsoft.com/office/drawing/2016/5/13/chartex" xmlns:cx8="http://schemas.microsoft.com/office/drawing/2016/5/14/chartex" xmlns:mc="http://schemas.openxmlformats.org/markup-compatibility/2006" xmlns:aink="http://schemas.microsoft.com/office/drawing/2016/ink" xmlns:am3d="http://schemas.microsoft.com/office/drawing/2017/model3d" xmlns:o="urn:schemas-microsoft-com:office:office" xmlns:oel="http://schemas.microsoft.com/office/2019/extlst" xmlns:r="http://schemas.openxmlformats.org/officeDocument/2006/relationships" xmlns:m="http://schemas.openxmlformats.org/officeDocument/2006/math" xmlns:v="urn:schemas-microsoft-com:vml" xmlns:wp14="http://schemas.microsoft.com/office/word/2010/wordprocessingDrawing" xmlns:wp="http://schemas.openxmlformats.org/drawingml/2006/wordprocessingDrawing" xmlns:w10="urn:schemas-microsoft-com:office:word" xmlns:w="http://schemas.openxmlformats.org/wordprocessingml/2006/main" xmlns:w14="http://schemas.microsoft.com/office/word/2010/wordml" xmlns:w15="http://schemas.microsoft.com/office/word/2012/wordml" xmlns:w16cex="http://schemas.microsoft.com/office/word/2018/wordml/cex" xmlns:w16cid="http://schemas.microsoft.com/office/word/2016/wordml/cid" xmlns:w16="http://schemas.microsoft.com/office/word/2018/wordml" xmlns:w16du="http://schemas.microsoft.com/office/word/2023/wordml/word16du" xmlns:w16sdtdh="http://schemas.microsoft.com/office/word/2020/wordml/sdtdatahash" xmlns:w16sdtfl="http://schemas.microsoft.com/office/word/2024/wordml/sdtformatlock" xmlns:w16se="http://schemas.microsoft.com/office/word/2015/wordml/symex" xmlns:wpg="http://schemas.microsoft.com/office/word/2010/wordprocessingGroup" xmlns:wpi="http://schemas.microsoft.com/office/word/2010/wordprocessingInk" xmlns:wne="http://schemas.microsoft.com/office/word/2006/wordml" xmlns:wps="http://schemas.microsoft.com/office/word/2010/wordprocessingShape" mc:Ignorable="w14 w15 w16se w16cid w16 w16cex w16sdtdh w16sdtfl w16du wp14">
+<w:document xmlns:wpc="http://schemas.microsoft.com/office/word/2010/wordprocessingCanvas" xmlns:cx="http://schemas.microsoft.com/office/drawing/2014/chartex" xmlns:cx1="http://schemas.microsoft.com/office/drawing/2015/9/8/chartex" xmlns:cx2="http://schemas.microsoft.com/office/drawing/2015/10/21/chartex" xmlns:cx3="http://schemas.microsoft.com/office/drawing/2016/5/9/chartex" xmlns:cx4="http://schemas.microsoft.com/office/drawing/2016/5/10/chartex" xmlns:cx5="http://schemas.microsoft.com/office/drawing/2016/5/11/chartex" xmlns:cx6="http://schemas.microsoft.com/office/drawing/2016/5/12/chartex" xmlns:cx7="http://schemas.microsoft.com/office/drawing/2016/5/13/chartex" xmlns:cx8="http://schemas.microsoft.com/office/drawing/2016/5/14/chartex" xmlns:mc="http://schemas.openxmlformats.org/markup-compatibility/2006" xmlns:aink="http://schemas.microsoft.com/office/drawing/2016/ink" xmlns:am3d="http://schemas.microsoft.com/office/drawing/2017/model3d" xmlns:o="urn:schemas-microsoft-com:office:office" xmlns:oel="http://schemas.microsoft.com/office/2019/extlst" xmlns:r="http://schemas.openxmlformats.org/officeDocument/2006/relationships" xmlns:m="http://schemas.openxmlformats.org/officeDocument/2006/math" xmlns:v="urn:schemas-microsoft-com:vml" xmlns:wp14="http://schemas.microsoft.com/office/word/2010/wordprocessingDrawing" xmlns:wp="http://schemas.openxmlformats.org/drawingml/2006/wordprocessingDrawing" xmlns:w10="urn:schemas-microsoft-com:office:word" xmlns:w="http://schemas.openxmlformats.org/wordprocessingml/2006/main" xmlns:w14="http://schemas.microsoft.com/office/word/2010/wordml" xmlns:w15="http://schemas.microsoft.com/office/word/2012/wordml" xmlns:w16cex="http://schemas.microsoft.com/office/word/2018/wordml/cex" xmlns:w16cid="http://schemas.microsoft.com/office/word/2016/wordml/cid" xmlns:w16="http://schemas.microsoft.com/office/word/2018/wordml" xmlns:w16sdtdh="http://schemas.microsoft.com/office/word/2020/wordml/sdtdatahash" xmlns:w16se="http://schemas.microsoft.com/office/word/2015/wordml/symex" xmlns:wpg="http://schemas.microsoft.com/office/word/2010/wordprocessingGroup" xmlns:wpi="http://schemas.microsoft.com/office/word/2010/wordprocessingInk" xmlns:wne="http://schemas.microsoft.com/office/word/2006/wordml" xmlns:wps="http://schemas.microsoft.com/office/word/2010/wordprocessingShape" mc:Ignorable="w14 w15 w16se w16cid w16 w16cex w16sdtdh wp14">
   <w:body>
     <w:p>
       <w:pPr>
@@ -4874,7 +4874,7 @@
       </w:r>
       <w:r>
         <w:rPr>
-          <w:rStyle w:val="FootnoteReference"/>
+          <w:rStyle w:val="Voetnootmarkering"/>
           <w:rFonts w:ascii="Times New Roman" w:hAnsi="Times New Roman" w:cs="Times New Roman"/>
           <w:sz w:val="24"/>
           <w:szCs w:val="24"/>
@@ -5204,7 +5204,6 @@
           <w:szCs w:val="24"/>
           <w:lang w:val="la-Latn"/>
         </w:rPr>
-        <w:lastRenderedPageBreak/>
         <w:t xml:space="preserve">(145) </w:t>
       </w:r>
       <w:r>
@@ -6226,7 +6225,6 @@
           <w:szCs w:val="24"/>
           <w:lang w:val="la-Latn"/>
         </w:rPr>
-        <w:lastRenderedPageBreak/>
         <w:t>Mit den Hoͤrner sie uns drewen.</w:t>
       </w:r>
     </w:p>
@@ -7381,7 +7379,6 @@
           <w:szCs w:val="24"/>
           <w:lang w:val="la-Latn"/>
         </w:rPr>
-        <w:lastRenderedPageBreak/>
         <w:t>Celebrate fortes ausus:</w:t>
       </w:r>
     </w:p>
@@ -8446,7 +8443,6 @@
           <w:szCs w:val="24"/>
           <w:lang w:val="la-Latn"/>
         </w:rPr>
-        <w:lastRenderedPageBreak/>
         <w:t>)( 10 )(</w:t>
       </w:r>
     </w:p>
@@ -9395,7 +9391,6 @@
           <w:szCs w:val="24"/>
           <w:lang w:val="la-Latn"/>
         </w:rPr>
-        <w:lastRenderedPageBreak/>
         <w:t>Wie auch heischet mit dem Nahmen:</w:t>
       </w:r>
     </w:p>
@@ -10428,7 +10423,6 @@
           <w:szCs w:val="24"/>
           <w:lang w:val="la-Latn"/>
         </w:rPr>
-        <w:lastRenderedPageBreak/>
         <w:t>Die Wellen halten ein:</w:t>
       </w:r>
     </w:p>
@@ -11746,7 +11740,6 @@
           <w:szCs w:val="24"/>
           <w:lang w:val="la-Latn"/>
         </w:rPr>
-        <w:lastRenderedPageBreak/>
         <w:t>Pugnant; inflantur tubae.</w:t>
       </w:r>
     </w:p>
@@ -11941,7 +11934,7 @@
       </w:r>
       <w:r>
         <w:rPr>
-          <w:rStyle w:val="FootnoteReference"/>
+          <w:rStyle w:val="Voetnootmarkering"/>
           <w:rFonts w:ascii="Times New Roman" w:hAnsi="Times New Roman" w:cs="Times New Roman"/>
           <w:sz w:val="24"/>
           <w:szCs w:val="24"/>
@@ -12982,7 +12975,6 @@
           <w:szCs w:val="24"/>
           <w:lang w:val="la-Latn"/>
         </w:rPr>
-        <w:lastRenderedPageBreak/>
         <w:t>(15)</w:t>
       </w:r>
     </w:p>
@@ -14151,7 +14143,6 @@
           <w:szCs w:val="24"/>
           <w:lang w:val="la-Latn"/>
         </w:rPr>
-        <w:lastRenderedPageBreak/>
         <w:t>Malè prostitutae Veneris accusant ream,</w:t>
       </w:r>
     </w:p>
@@ -14285,7 +14276,7 @@
       </w:r>
       <w:r>
         <w:rPr>
-          <w:rStyle w:val="FootnoteReference"/>
+          <w:rStyle w:val="Voetnootmarkering"/>
           <w:rFonts w:ascii="Times New Roman" w:hAnsi="Times New Roman" w:cs="Times New Roman"/>
           <w:sz w:val="24"/>
           <w:szCs w:val="24"/>
@@ -15137,7 +15128,7 @@
       </w:r>
       <w:r>
         <w:rPr>
-          <w:rStyle w:val="FootnoteReference"/>
+          <w:rStyle w:val="Voetnootmarkering"/>
           <w:rFonts w:ascii="Times New Roman" w:hAnsi="Times New Roman" w:cs="Times New Roman"/>
           <w:sz w:val="24"/>
           <w:szCs w:val="24"/>
@@ -15260,7 +15251,6 @@
           <w:szCs w:val="24"/>
           <w:lang w:val="la-Latn"/>
         </w:rPr>
-        <w:lastRenderedPageBreak/>
         <w:t>Scintilla qualis parva quae latuit diu</w:t>
       </w:r>
     </w:p>
@@ -16634,7 +16624,6 @@
           <w:szCs w:val="24"/>
           <w:lang w:val="la-Latn"/>
         </w:rPr>
-        <w:lastRenderedPageBreak/>
         <w:t>Magno expetitam stemmati consors thori</w:t>
       </w:r>
     </w:p>
@@ -17852,7 +17841,6 @@
           <w:szCs w:val="24"/>
           <w:lang w:val="la-Latn"/>
         </w:rPr>
-        <w:lastRenderedPageBreak/>
         <w:t>(20)</w:t>
       </w:r>
     </w:p>
@@ -19119,7 +19107,6 @@
           <w:szCs w:val="24"/>
           <w:lang w:val="la-Latn"/>
         </w:rPr>
-        <w:lastRenderedPageBreak/>
         <w:t>@Consc.=</w:t>
       </w:r>
       <w:r>
@@ -19672,7 +19659,7 @@
       </w:r>
       <w:r>
         <w:rPr>
-          <w:rStyle w:val="FootnoteReference"/>
+          <w:rStyle w:val="Voetnootmarkering"/>
           <w:rFonts w:ascii="Times New Roman" w:hAnsi="Times New Roman" w:cs="Times New Roman"/>
           <w:sz w:val="24"/>
           <w:szCs w:val="24"/>
@@ -20722,7 +20709,6 @@
           <w:szCs w:val="24"/>
           <w:lang w:val="la-Latn"/>
         </w:rPr>
-        <w:lastRenderedPageBreak/>
         <w:t>Sed mitigatas. Diva; quae trutinâ pari</w:t>
       </w:r>
     </w:p>
@@ -21736,7 +21722,6 @@
           <w:szCs w:val="24"/>
           <w:lang w:val="la-Latn"/>
         </w:rPr>
-        <w:lastRenderedPageBreak/>
         <w:t>4. Wan ich JEsum thu’ umbhälsen</w:t>
       </w:r>
     </w:p>
@@ -21939,7 +21924,7 @@
       </w:r>
       <w:r>
         <w:rPr>
-          <w:rStyle w:val="FootnoteReference"/>
+          <w:rStyle w:val="Voetnootmarkering"/>
           <w:rFonts w:ascii="Times New Roman" w:hAnsi="Times New Roman" w:cs="Times New Roman"/>
           <w:sz w:val="24"/>
           <w:szCs w:val="24"/>
@@ -22796,7 +22781,6 @@
           <w:szCs w:val="24"/>
           <w:lang w:val="la-Latn"/>
         </w:rPr>
-        <w:lastRenderedPageBreak/>
         <w:t>Nach diesem Leben ein.</w:t>
       </w:r>
     </w:p>
@@ -23908,7 +23892,6 @@
           <w:szCs w:val="24"/>
           <w:lang w:val="la-Latn"/>
         </w:rPr>
-        <w:lastRenderedPageBreak/>
         <w:t>Animo furorem, donec exstructam impiae</w:t>
       </w:r>
     </w:p>
@@ -25241,7 +25224,6 @@
           <w:szCs w:val="24"/>
           <w:lang w:val="la-Latn"/>
         </w:rPr>
-        <w:lastRenderedPageBreak/>
         <w:t>@1.=</w:t>
       </w:r>
       <w:r>
@@ -26345,7 +26327,6 @@
           <w:szCs w:val="24"/>
           <w:lang w:val="la-Latn"/>
         </w:rPr>
-        <w:lastRenderedPageBreak/>
         <w:t xml:space="preserve">(855) </w:t>
       </w:r>
       <w:r>
@@ -27488,7 +27469,6 @@
           <w:szCs w:val="24"/>
           <w:lang w:val="la-Latn"/>
         </w:rPr>
-        <w:lastRenderedPageBreak/>
         <w:t>Et dolorum millę fluctus.</w:t>
       </w:r>
     </w:p>
@@ -28553,7 +28533,6 @@
           <w:szCs w:val="24"/>
           <w:lang w:val="la-Latn"/>
         </w:rPr>
-        <w:lastRenderedPageBreak/>
         <w:t>@Sigref.= O Golo, Golo! ... tale quis vidit nefas ...</w:t>
       </w:r>
     </w:p>
@@ -29662,7 +29641,6 @@
           <w:szCs w:val="24"/>
           <w:lang w:val="la-Latn"/>
         </w:rPr>
-        <w:lastRenderedPageBreak/>
         <w:t>In Betrangnuss oder Macht.</w:t>
       </w:r>
     </w:p>
@@ -30619,7 +30597,6 @@
           <w:szCs w:val="24"/>
           <w:lang w:val="la-Latn"/>
         </w:rPr>
-        <w:lastRenderedPageBreak/>
         <w:t>Nichts hast/ so mir gefält.</w:t>
       </w:r>
     </w:p>
@@ -31554,7 +31531,6 @@
           <w:szCs w:val="24"/>
           <w:lang w:val="la-Latn"/>
         </w:rPr>
-        <w:lastRenderedPageBreak/>
         <w:t>Steh’ bey in letzter Noth.</w:t>
       </w:r>
     </w:p>
@@ -32437,7 +32413,7 @@
       </w:r>
       <w:r>
         <w:rPr>
-          <w:rStyle w:val="FootnoteReference"/>
+          <w:rStyle w:val="Voetnootmarkering"/>
           <w:rFonts w:ascii="Times New Roman" w:hAnsi="Times New Roman" w:cs="Times New Roman"/>
           <w:sz w:val="24"/>
           <w:szCs w:val="24"/>
@@ -32485,7 +32461,6 @@
           <w:szCs w:val="24"/>
           <w:lang w:val="la-Latn"/>
         </w:rPr>
-        <w:lastRenderedPageBreak/>
         <w:t>Sigefridus ad Venatorem.</w:t>
       </w:r>
     </w:p>
@@ -33236,7 +33211,7 @@
       </w:r>
       <w:r>
         <w:rPr>
-          <w:rStyle w:val="FootnoteReference"/>
+          <w:rStyle w:val="Voetnootmarkering"/>
           <w:rFonts w:ascii="Times New Roman" w:hAnsi="Times New Roman" w:cs="Times New Roman"/>
           <w:sz w:val="24"/>
           <w:szCs w:val="24"/>
@@ -33295,7 +33270,7 @@
       </w:r>
       <w:r>
         <w:rPr>
-          <w:rStyle w:val="FootnoteReference"/>
+          <w:rStyle w:val="Voetnootmarkering"/>
           <w:rFonts w:ascii="Times New Roman" w:hAnsi="Times New Roman" w:cs="Times New Roman"/>
           <w:sz w:val="24"/>
           <w:szCs w:val="24"/>
@@ -33419,7 +33394,6 @@
           <w:szCs w:val="24"/>
           <w:lang w:val="la-Latn"/>
         </w:rPr>
-        <w:lastRenderedPageBreak/>
         <w:t>Wie er verdient/ empfangen.</w:t>
       </w:r>
     </w:p>
@@ -33513,7 +33487,7 @@
       </w:r>
       <w:r>
         <w:rPr>
-          <w:rStyle w:val="FootnoteReference"/>
+          <w:rStyle w:val="Voetnootmarkering"/>
           <w:rFonts w:ascii="Times New Roman" w:hAnsi="Times New Roman" w:cs="Times New Roman"/>
           <w:sz w:val="24"/>
           <w:szCs w:val="24"/>
@@ -33819,7 +33793,7 @@
       </w:r>
       <w:r>
         <w:rPr>
-          <w:rStyle w:val="FootnoteReference"/>
+          <w:rStyle w:val="Voetnootmarkering"/>
           <w:rFonts w:ascii="Times New Roman" w:hAnsi="Times New Roman" w:cs="Times New Roman"/>
           <w:sz w:val="24"/>
           <w:szCs w:val="24"/>
@@ -34176,7 +34150,7 @@
       </w:r>
       <w:r>
         <w:rPr>
-          <w:rStyle w:val="FootnoteReference"/>
+          <w:rStyle w:val="Voetnootmarkering"/>
           <w:rFonts w:ascii="Times New Roman" w:hAnsi="Times New Roman" w:cs="Times New Roman"/>
           <w:sz w:val="24"/>
           <w:szCs w:val="24"/>
@@ -34400,7 +34374,6 @@
           <w:szCs w:val="24"/>
           <w:lang w:val="la-Latn"/>
         </w:rPr>
-        <w:lastRenderedPageBreak/>
         <w:t>Graff Sigfrid mein Vatter ist/</w:t>
       </w:r>
     </w:p>
@@ -34534,7 +34507,7 @@
       </w:r>
       <w:r>
         <w:rPr>
-          <w:rStyle w:val="FootnoteReference"/>
+          <w:rStyle w:val="Voetnootmarkering"/>
           <w:rFonts w:ascii="Times New Roman" w:hAnsi="Times New Roman" w:cs="Times New Roman"/>
           <w:sz w:val="24"/>
           <w:szCs w:val="24"/>
@@ -35148,7 +35121,7 @@
 </file>
 
 <file path=word/endnotes.xml><?xml version="1.0" encoding="utf-8"?>
-<w:endnotes xmlns:wpc="http://schemas.microsoft.com/office/word/2010/wordprocessingCanvas" xmlns:cx="http://schemas.microsoft.com/office/drawing/2014/chartex" xmlns:cx1="http://schemas.microsoft.com/office/drawing/2015/9/8/chartex" xmlns:cx2="http://schemas.microsoft.com/office/drawing/2015/10/21/chartex" xmlns:cx3="http://schemas.microsoft.com/office/drawing/2016/5/9/chartex" xmlns:cx4="http://schemas.microsoft.com/office/drawing/2016/5/10/chartex" xmlns:cx5="http://schemas.microsoft.com/office/drawing/2016/5/11/chartex" xmlns:cx6="http://schemas.microsoft.com/office/drawing/2016/5/12/chartex" xmlns:cx7="http://schemas.microsoft.com/office/drawing/2016/5/13/chartex" xmlns:cx8="http://schemas.microsoft.com/office/drawing/2016/5/14/chartex" xmlns:mc="http://schemas.openxmlformats.org/markup-compatibility/2006" xmlns:aink="http://schemas.microsoft.com/office/drawing/2016/ink" xmlns:am3d="http://schemas.microsoft.com/office/drawing/2017/model3d" xmlns:o="urn:schemas-microsoft-com:office:office" xmlns:oel="http://schemas.microsoft.com/office/2019/extlst" xmlns:r="http://schemas.openxmlformats.org/officeDocument/2006/relationships" xmlns:m="http://schemas.openxmlformats.org/officeDocument/2006/math" xmlns:v="urn:schemas-microsoft-com:vml" xmlns:wp14="http://schemas.microsoft.com/office/word/2010/wordprocessingDrawing" xmlns:wp="http://schemas.openxmlformats.org/drawingml/2006/wordprocessingDrawing" xmlns:w10="urn:schemas-microsoft-com:office:word" xmlns:w="http://schemas.openxmlformats.org/wordprocessingml/2006/main" xmlns:w14="http://schemas.microsoft.com/office/word/2010/wordml" xmlns:w15="http://schemas.microsoft.com/office/word/2012/wordml" xmlns:w16cex="http://schemas.microsoft.com/office/word/2018/wordml/cex" xmlns:w16cid="http://schemas.microsoft.com/office/word/2016/wordml/cid" xmlns:w16="http://schemas.microsoft.com/office/word/2018/wordml" xmlns:w16du="http://schemas.microsoft.com/office/word/2023/wordml/word16du" xmlns:w16sdtdh="http://schemas.microsoft.com/office/word/2020/wordml/sdtdatahash" xmlns:w16sdtfl="http://schemas.microsoft.com/office/word/2024/wordml/sdtformatlock" xmlns:w16se="http://schemas.microsoft.com/office/word/2015/wordml/symex" xmlns:wpg="http://schemas.microsoft.com/office/word/2010/wordprocessingGroup" xmlns:wpi="http://schemas.microsoft.com/office/word/2010/wordprocessingInk" xmlns:wne="http://schemas.microsoft.com/office/word/2006/wordml" xmlns:wps="http://schemas.microsoft.com/office/word/2010/wordprocessingShape" mc:Ignorable="w14 w15 w16se w16cid w16 w16cex w16sdtdh w16sdtfl w16du wp14">
+<w:endnotes xmlns:wpc="http://schemas.microsoft.com/office/word/2010/wordprocessingCanvas" xmlns:cx="http://schemas.microsoft.com/office/drawing/2014/chartex" xmlns:cx1="http://schemas.microsoft.com/office/drawing/2015/9/8/chartex" xmlns:cx2="http://schemas.microsoft.com/office/drawing/2015/10/21/chartex" xmlns:cx3="http://schemas.microsoft.com/office/drawing/2016/5/9/chartex" xmlns:cx4="http://schemas.microsoft.com/office/drawing/2016/5/10/chartex" xmlns:cx5="http://schemas.microsoft.com/office/drawing/2016/5/11/chartex" xmlns:cx6="http://schemas.microsoft.com/office/drawing/2016/5/12/chartex" xmlns:cx7="http://schemas.microsoft.com/office/drawing/2016/5/13/chartex" xmlns:cx8="http://schemas.microsoft.com/office/drawing/2016/5/14/chartex" xmlns:mc="http://schemas.openxmlformats.org/markup-compatibility/2006" xmlns:aink="http://schemas.microsoft.com/office/drawing/2016/ink" xmlns:am3d="http://schemas.microsoft.com/office/drawing/2017/model3d" xmlns:o="urn:schemas-microsoft-com:office:office" xmlns:oel="http://schemas.microsoft.com/office/2019/extlst" xmlns:r="http://schemas.openxmlformats.org/officeDocument/2006/relationships" xmlns:m="http://schemas.openxmlformats.org/officeDocument/2006/math" xmlns:v="urn:schemas-microsoft-com:vml" xmlns:wp14="http://schemas.microsoft.com/office/word/2010/wordprocessingDrawing" xmlns:wp="http://schemas.openxmlformats.org/drawingml/2006/wordprocessingDrawing" xmlns:w10="urn:schemas-microsoft-com:office:word" xmlns:w="http://schemas.openxmlformats.org/wordprocessingml/2006/main" xmlns:w14="http://schemas.microsoft.com/office/word/2010/wordml" xmlns:w15="http://schemas.microsoft.com/office/word/2012/wordml" xmlns:w16cex="http://schemas.microsoft.com/office/word/2018/wordml/cex" xmlns:w16cid="http://schemas.microsoft.com/office/word/2016/wordml/cid" xmlns:w16="http://schemas.microsoft.com/office/word/2018/wordml" xmlns:w16sdtdh="http://schemas.microsoft.com/office/word/2020/wordml/sdtdatahash" xmlns:w16se="http://schemas.microsoft.com/office/word/2015/wordml/symex" xmlns:wpg="http://schemas.microsoft.com/office/word/2010/wordprocessingGroup" xmlns:wpi="http://schemas.microsoft.com/office/word/2010/wordprocessingInk" xmlns:wne="http://schemas.microsoft.com/office/word/2006/wordml" xmlns:wps="http://schemas.microsoft.com/office/word/2010/wordprocessingShape" mc:Ignorable="w14 w15 w16se w16cid w16 w16cex w16sdtdh wp14">
   <w:endnote w:type="separator" w:id="-1">
     <w:p>
       <w:pPr>
@@ -35173,7 +35146,7 @@
 </file>
 
 <file path=word/footnotes.xml><?xml version="1.0" encoding="utf-8"?>
-<w:footnotes xmlns:wpc="http://schemas.microsoft.com/office/word/2010/wordprocessingCanvas" xmlns:cx="http://schemas.microsoft.com/office/drawing/2014/chartex" xmlns:cx1="http://schemas.microsoft.com/office/drawing/2015/9/8/chartex" xmlns:cx2="http://schemas.microsoft.com/office/drawing/2015/10/21/chartex" xmlns:cx3="http://schemas.microsoft.com/office/drawing/2016/5/9/chartex" xmlns:cx4="http://schemas.microsoft.com/office/drawing/2016/5/10/chartex" xmlns:cx5="http://schemas.microsoft.com/office/drawing/2016/5/11/chartex" xmlns:cx6="http://schemas.microsoft.com/office/drawing/2016/5/12/chartex" xmlns:cx7="http://schemas.microsoft.com/office/drawing/2016/5/13/chartex" xmlns:cx8="http://schemas.microsoft.com/office/drawing/2016/5/14/chartex" xmlns:mc="http://schemas.openxmlformats.org/markup-compatibility/2006" xmlns:aink="http://schemas.microsoft.com/office/drawing/2016/ink" xmlns:am3d="http://schemas.microsoft.com/office/drawing/2017/model3d" xmlns:o="urn:schemas-microsoft-com:office:office" xmlns:oel="http://schemas.microsoft.com/office/2019/extlst" xmlns:r="http://schemas.openxmlformats.org/officeDocument/2006/relationships" xmlns:m="http://schemas.openxmlformats.org/officeDocument/2006/math" xmlns:v="urn:schemas-microsoft-com:vml" xmlns:wp14="http://schemas.microsoft.com/office/word/2010/wordprocessingDrawing" xmlns:wp="http://schemas.openxmlformats.org/drawingml/2006/wordprocessingDrawing" xmlns:w10="urn:schemas-microsoft-com:office:word" xmlns:w="http://schemas.openxmlformats.org/wordprocessingml/2006/main" xmlns:w14="http://schemas.microsoft.com/office/word/2010/wordml" xmlns:w15="http://schemas.microsoft.com/office/word/2012/wordml" xmlns:w16cex="http://schemas.microsoft.com/office/word/2018/wordml/cex" xmlns:w16cid="http://schemas.microsoft.com/office/word/2016/wordml/cid" xmlns:w16="http://schemas.microsoft.com/office/word/2018/wordml" xmlns:w16du="http://schemas.microsoft.com/office/word/2023/wordml/word16du" xmlns:w16sdtdh="http://schemas.microsoft.com/office/word/2020/wordml/sdtdatahash" xmlns:w16sdtfl="http://schemas.microsoft.com/office/word/2024/wordml/sdtformatlock" xmlns:w16se="http://schemas.microsoft.com/office/word/2015/wordml/symex" xmlns:wpg="http://schemas.microsoft.com/office/word/2010/wordprocessingGroup" xmlns:wpi="http://schemas.microsoft.com/office/word/2010/wordprocessingInk" xmlns:wne="http://schemas.microsoft.com/office/word/2006/wordml" xmlns:wps="http://schemas.microsoft.com/office/word/2010/wordprocessingShape" mc:Ignorable="w14 w15 w16se w16cid w16 w16cex w16sdtdh w16sdtfl w16du wp14">
+<w:footnotes xmlns:wpc="http://schemas.microsoft.com/office/word/2010/wordprocessingCanvas" xmlns:cx="http://schemas.microsoft.com/office/drawing/2014/chartex" xmlns:cx1="http://schemas.microsoft.com/office/drawing/2015/9/8/chartex" xmlns:cx2="http://schemas.microsoft.com/office/drawing/2015/10/21/chartex" xmlns:cx3="http://schemas.microsoft.com/office/drawing/2016/5/9/chartex" xmlns:cx4="http://schemas.microsoft.com/office/drawing/2016/5/10/chartex" xmlns:cx5="http://schemas.microsoft.com/office/drawing/2016/5/11/chartex" xmlns:cx6="http://schemas.microsoft.com/office/drawing/2016/5/12/chartex" xmlns:cx7="http://schemas.microsoft.com/office/drawing/2016/5/13/chartex" xmlns:cx8="http://schemas.microsoft.com/office/drawing/2016/5/14/chartex" xmlns:mc="http://schemas.openxmlformats.org/markup-compatibility/2006" xmlns:aink="http://schemas.microsoft.com/office/drawing/2016/ink" xmlns:am3d="http://schemas.microsoft.com/office/drawing/2017/model3d" xmlns:o="urn:schemas-microsoft-com:office:office" xmlns:oel="http://schemas.microsoft.com/office/2019/extlst" xmlns:r="http://schemas.openxmlformats.org/officeDocument/2006/relationships" xmlns:m="http://schemas.openxmlformats.org/officeDocument/2006/math" xmlns:v="urn:schemas-microsoft-com:vml" xmlns:wp14="http://schemas.microsoft.com/office/word/2010/wordprocessingDrawing" xmlns:wp="http://schemas.openxmlformats.org/drawingml/2006/wordprocessingDrawing" xmlns:w10="urn:schemas-microsoft-com:office:word" xmlns:w="http://schemas.openxmlformats.org/wordprocessingml/2006/main" xmlns:w14="http://schemas.microsoft.com/office/word/2010/wordml" xmlns:w15="http://schemas.microsoft.com/office/word/2012/wordml" xmlns:w16cex="http://schemas.microsoft.com/office/word/2018/wordml/cex" xmlns:w16cid="http://schemas.microsoft.com/office/word/2016/wordml/cid" xmlns:w16="http://schemas.microsoft.com/office/word/2018/wordml" xmlns:w16sdtdh="http://schemas.microsoft.com/office/word/2020/wordml/sdtdatahash" xmlns:w16se="http://schemas.microsoft.com/office/word/2015/wordml/symex" xmlns:wpg="http://schemas.microsoft.com/office/word/2010/wordprocessingGroup" xmlns:wpi="http://schemas.microsoft.com/office/word/2010/wordprocessingInk" xmlns:wne="http://schemas.microsoft.com/office/word/2006/wordml" xmlns:wps="http://schemas.microsoft.com/office/word/2010/wordprocessingShape" mc:Ignorable="w14 w15 w16se w16cid w16 w16cex w16sdtdh wp14">
   <w:footnote w:type="separator" w:id="-1">
     <w:p>
       <w:pPr>
@@ -35197,14 +35170,14 @@
   <w:footnote w:id="1">
     <w:p>
       <w:pPr>
-        <w:pStyle w:val="FootnoteText"/>
-        <w:rPr>
-          <w:rFonts w:ascii="Times New Roman" w:hAnsi="Times New Roman" w:cs="Times New Roman"/>
-        </w:rPr>
-      </w:pPr>
-      <w:r>
-        <w:rPr>
-          <w:rStyle w:val="FootnoteReference"/>
+        <w:pStyle w:val="Voetnoottekst"/>
+        <w:rPr>
+          <w:rFonts w:ascii="Times New Roman" w:hAnsi="Times New Roman" w:cs="Times New Roman"/>
+        </w:rPr>
+      </w:pPr>
+      <w:r>
+        <w:rPr>
+          <w:rStyle w:val="Voetnootmarkering"/>
           <w:rFonts w:ascii="Times New Roman" w:hAnsi="Times New Roman" w:cs="Times New Roman"/>
         </w:rPr>
         <w:footnoteRef/>
@@ -35235,14 +35208,14 @@
   <w:footnote w:id="2">
     <w:p>
       <w:pPr>
-        <w:pStyle w:val="FootnoteText"/>
-        <w:rPr>
-          <w:rFonts w:ascii="Times New Roman" w:hAnsi="Times New Roman" w:cs="Times New Roman"/>
-        </w:rPr>
-      </w:pPr>
-      <w:r>
-        <w:rPr>
-          <w:rStyle w:val="FootnoteReference"/>
+        <w:pStyle w:val="Voetnoottekst"/>
+        <w:rPr>
+          <w:rFonts w:ascii="Times New Roman" w:hAnsi="Times New Roman" w:cs="Times New Roman"/>
+        </w:rPr>
+      </w:pPr>
+      <w:r>
+        <w:rPr>
+          <w:rStyle w:val="Voetnootmarkering"/>
           <w:rFonts w:ascii="Times New Roman" w:hAnsi="Times New Roman" w:cs="Times New Roman"/>
         </w:rPr>
         <w:footnoteRef/>
@@ -35313,14 +35286,14 @@
   <w:footnote w:id="3">
     <w:p>
       <w:pPr>
-        <w:pStyle w:val="FootnoteText"/>
-        <w:rPr>
-          <w:rFonts w:ascii="Times New Roman" w:hAnsi="Times New Roman" w:cs="Times New Roman"/>
-        </w:rPr>
-      </w:pPr>
-      <w:r>
-        <w:rPr>
-          <w:rStyle w:val="FootnoteReference"/>
+        <w:pStyle w:val="Voetnoottekst"/>
+        <w:rPr>
+          <w:rFonts w:ascii="Times New Roman" w:hAnsi="Times New Roman" w:cs="Times New Roman"/>
+        </w:rPr>
+      </w:pPr>
+      <w:r>
+        <w:rPr>
+          <w:rStyle w:val="Voetnootmarkering"/>
           <w:rFonts w:ascii="Times New Roman" w:hAnsi="Times New Roman" w:cs="Times New Roman"/>
         </w:rPr>
         <w:footnoteRef/>
@@ -35358,7 +35331,7 @@
   <w:footnote w:id="4">
     <w:p>
       <w:pPr>
-        <w:pStyle w:val="FootnoteText"/>
+        <w:pStyle w:val="Voetnoottekst"/>
         <w:rPr>
           <w:rFonts w:ascii="Times New Roman" w:hAnsi="Times New Roman" w:cs="Times New Roman"/>
           <w:i/>
@@ -35367,7 +35340,7 @@
       </w:pPr>
       <w:r>
         <w:rPr>
-          <w:rStyle w:val="FootnoteReference"/>
+          <w:rStyle w:val="Voetnootmarkering"/>
           <w:rFonts w:ascii="Times New Roman" w:hAnsi="Times New Roman" w:cs="Times New Roman"/>
         </w:rPr>
         <w:footnoteRef/>
@@ -35406,7 +35379,7 @@
   <w:footnote w:id="5">
     <w:p>
       <w:pPr>
-        <w:pStyle w:val="FootnoteText"/>
+        <w:pStyle w:val="Voetnoottekst"/>
         <w:rPr>
           <w:rFonts w:ascii="Times New Roman" w:hAnsi="Times New Roman" w:cs="Times New Roman"/>
           <w:i/>
@@ -35415,7 +35388,7 @@
       </w:pPr>
       <w:r>
         <w:rPr>
-          <w:rStyle w:val="FootnoteReference"/>
+          <w:rStyle w:val="Voetnootmarkering"/>
           <w:rFonts w:ascii="Times New Roman" w:hAnsi="Times New Roman" w:cs="Times New Roman"/>
         </w:rPr>
         <w:footnoteRef/>
@@ -35464,7 +35437,7 @@
       </w:pPr>
       <w:r>
         <w:rPr>
-          <w:rStyle w:val="FootnoteReference"/>
+          <w:rStyle w:val="Voetnootmarkering"/>
           <w:rFonts w:ascii="Times New Roman" w:hAnsi="Times New Roman" w:cs="Times New Roman"/>
           <w:sz w:val="20"/>
           <w:szCs w:val="20"/>
@@ -35512,7 +35485,7 @@
     </w:p>
     <w:p>
       <w:pPr>
-        <w:pStyle w:val="FootnoteText"/>
+        <w:pStyle w:val="Voetnoottekst"/>
         <w:rPr>
           <w:lang w:val="en-US"/>
         </w:rPr>
@@ -35522,14 +35495,14 @@
   <w:footnote w:id="7">
     <w:p>
       <w:pPr>
-        <w:pStyle w:val="FootnoteText"/>
-        <w:rPr>
-          <w:rFonts w:ascii="Times New Roman" w:hAnsi="Times New Roman" w:cs="Times New Roman"/>
-        </w:rPr>
-      </w:pPr>
-      <w:r>
-        <w:rPr>
-          <w:rStyle w:val="FootnoteReference"/>
+        <w:pStyle w:val="Voetnoottekst"/>
+        <w:rPr>
+          <w:rFonts w:ascii="Times New Roman" w:hAnsi="Times New Roman" w:cs="Times New Roman"/>
+        </w:rPr>
+      </w:pPr>
+      <w:r>
+        <w:rPr>
+          <w:rStyle w:val="Voetnootmarkering"/>
           <w:rFonts w:ascii="Times New Roman" w:hAnsi="Times New Roman" w:cs="Times New Roman"/>
         </w:rPr>
         <w:footnoteRef/>
@@ -35566,14 +35539,14 @@
   <w:footnote w:id="8">
     <w:p>
       <w:pPr>
-        <w:pStyle w:val="FootnoteText"/>
-        <w:rPr>
-          <w:rFonts w:ascii="Times New Roman" w:hAnsi="Times New Roman" w:cs="Times New Roman"/>
-        </w:rPr>
-      </w:pPr>
-      <w:r>
-        <w:rPr>
-          <w:rStyle w:val="FootnoteReference"/>
+        <w:pStyle w:val="Voetnoottekst"/>
+        <w:rPr>
+          <w:rFonts w:ascii="Times New Roman" w:hAnsi="Times New Roman" w:cs="Times New Roman"/>
+        </w:rPr>
+      </w:pPr>
+      <w:r>
+        <w:rPr>
+          <w:rStyle w:val="Voetnootmarkering"/>
           <w:rFonts w:ascii="Times New Roman" w:hAnsi="Times New Roman" w:cs="Times New Roman"/>
         </w:rPr>
         <w:footnoteRef/>
@@ -35611,11 +35584,11 @@
   <w:footnote w:id="9">
     <w:p>
       <w:pPr>
-        <w:pStyle w:val="FootnoteText"/>
-      </w:pPr>
-      <w:r>
-        <w:rPr>
-          <w:rStyle w:val="FootnoteReference"/>
+        <w:pStyle w:val="Voetnoottekst"/>
+      </w:pPr>
+      <w:r>
+        <w:rPr>
+          <w:rStyle w:val="Voetnootmarkering"/>
           <w:rFonts w:ascii="Times New Roman" w:hAnsi="Times New Roman" w:cs="Times New Roman"/>
         </w:rPr>
         <w:footnoteRef/>
@@ -35670,7 +35643,7 @@
       </w:pPr>
       <w:r>
         <w:rPr>
-          <w:rStyle w:val="FootnoteReference"/>
+          <w:rStyle w:val="Voetnootmarkering"/>
           <w:rFonts w:ascii="Times New Roman" w:hAnsi="Times New Roman" w:cs="Times New Roman"/>
           <w:sz w:val="20"/>
           <w:szCs w:val="20"/>
@@ -35720,7 +35693,7 @@
   <w:footnote w:id="11">
     <w:p>
       <w:pPr>
-        <w:pStyle w:val="FootnoteText"/>
+        <w:pStyle w:val="Voetnoottekst"/>
         <w:rPr>
           <w:rFonts w:ascii="Times New Roman" w:hAnsi="Times New Roman" w:cs="Times New Roman"/>
           <w:i/>
@@ -35730,7 +35703,7 @@
       </w:pPr>
       <w:r>
         <w:rPr>
-          <w:rStyle w:val="FootnoteReference"/>
+          <w:rStyle w:val="Voetnootmarkering"/>
           <w:rFonts w:ascii="Times New Roman" w:hAnsi="Times New Roman" w:cs="Times New Roman"/>
         </w:rPr>
         <w:footnoteRef/>
@@ -35763,7 +35736,7 @@
   <w:footnote w:id="12">
     <w:p>
       <w:pPr>
-        <w:pStyle w:val="FootnoteText"/>
+        <w:pStyle w:val="Voetnoottekst"/>
         <w:rPr>
           <w:i/>
           <w:iCs/>
@@ -35772,7 +35745,7 @@
       </w:pPr>
       <w:r>
         <w:rPr>
-          <w:rStyle w:val="FootnoteReference"/>
+          <w:rStyle w:val="Voetnootmarkering"/>
           <w:rFonts w:ascii="Times New Roman" w:hAnsi="Times New Roman" w:cs="Times New Roman"/>
         </w:rPr>
         <w:footnoteRef/>
@@ -35814,7 +35787,7 @@
   <w:footnote w:id="13">
     <w:p>
       <w:pPr>
-        <w:pStyle w:val="FootnoteText"/>
+        <w:pStyle w:val="Voetnoottekst"/>
         <w:rPr>
           <w:rFonts w:ascii="Times New Roman" w:hAnsi="Times New Roman" w:cs="Times New Roman"/>
           <w:lang w:val="en-US"/>
@@ -35822,7 +35795,7 @@
       </w:pPr>
       <w:r>
         <w:rPr>
-          <w:rStyle w:val="FootnoteReference"/>
+          <w:rStyle w:val="Voetnootmarkering"/>
           <w:rFonts w:ascii="Times New Roman" w:hAnsi="Times New Roman" w:cs="Times New Roman"/>
         </w:rPr>
         <w:footnoteRef/>
@@ -35863,7 +35836,7 @@
 </file>
 
 <file path=word/styles.xml><?xml version="1.0" encoding="utf-8"?>
-<w:styles xmlns:mc="http://schemas.openxmlformats.org/markup-compatibility/2006" xmlns:r="http://schemas.openxmlformats.org/officeDocument/2006/relationships" xmlns:w="http://schemas.openxmlformats.org/wordprocessingml/2006/main" xmlns:w14="http://schemas.microsoft.com/office/word/2010/wordml" xmlns:w15="http://schemas.microsoft.com/office/word/2012/wordml" xmlns:w16cex="http://schemas.microsoft.com/office/word/2018/wordml/cex" xmlns:w16cid="http://schemas.microsoft.com/office/word/2016/wordml/cid" xmlns:w16="http://schemas.microsoft.com/office/word/2018/wordml" xmlns:w16du="http://schemas.microsoft.com/office/word/2023/wordml/word16du" xmlns:w16sdtdh="http://schemas.microsoft.com/office/word/2020/wordml/sdtdatahash" xmlns:w16sdtfl="http://schemas.microsoft.com/office/word/2024/wordml/sdtformatlock" xmlns:w16se="http://schemas.microsoft.com/office/word/2015/wordml/symex" mc:Ignorable="w14 w15 w16se w16cid w16 w16cex w16sdtdh w16sdtfl w16du">
+<w:styles xmlns:mc="http://schemas.openxmlformats.org/markup-compatibility/2006" xmlns:r="http://schemas.openxmlformats.org/officeDocument/2006/relationships" xmlns:w="http://schemas.openxmlformats.org/wordprocessingml/2006/main" xmlns:w14="http://schemas.microsoft.com/office/word/2010/wordml" xmlns:w15="http://schemas.microsoft.com/office/word/2012/wordml" xmlns:w16cex="http://schemas.microsoft.com/office/word/2018/wordml/cex" xmlns:w16cid="http://schemas.microsoft.com/office/word/2016/wordml/cid" xmlns:w16="http://schemas.microsoft.com/office/word/2018/wordml" xmlns:w16sdtdh="http://schemas.microsoft.com/office/word/2020/wordml/sdtdatahash" xmlns:w16se="http://schemas.microsoft.com/office/word/2015/wordml/symex" mc:Ignorable="w14 w15 w16se w16cid w16 w16cex w16sdtdh">
   <w:docDefaults>
     <w:rPrDefault>
       <w:rPr>
@@ -35871,7 +35844,7 @@
         <w:kern w:val="2"/>
         <w:sz w:val="24"/>
         <w:szCs w:val="24"/>
-        <w:lang w:val="en-NL" w:eastAsia="en-US" w:bidi="ar-SA"/>
+        <w:lang w:eastAsia="en-US" w:bidi="ar-SA"/>
         <w14:ligatures w14:val="standardContextual"/>
       </w:rPr>
     </w:rPrDefault>
@@ -36255,7 +36228,7 @@
     <w:lsdException w:name="Unresolved Mention" w:semiHidden="1" w:unhideWhenUsed="1"/>
     <w:lsdException w:name="Smart Link" w:semiHidden="1" w:unhideWhenUsed="1"/>
   </w:latentStyles>
-  <w:style w:type="paragraph" w:default="1" w:styleId="Normal">
+  <w:style w:type="paragraph" w:default="1" w:styleId="Standaard">
     <w:name w:val="Normal"/>
     <w:qFormat/>
     <w:rsid w:val="002A1E46"/>
@@ -36271,11 +36244,11 @@
       <w14:ligatures w14:val="none"/>
     </w:rPr>
   </w:style>
-  <w:style w:type="paragraph" w:styleId="Heading1">
+  <w:style w:type="paragraph" w:styleId="Kop1">
     <w:name w:val="heading 1"/>
-    <w:basedOn w:val="Normal"/>
-    <w:next w:val="Normal"/>
-    <w:link w:val="Heading1Char"/>
+    <w:basedOn w:val="Standaard"/>
+    <w:next w:val="Standaard"/>
+    <w:link w:val="Kop1Char"/>
     <w:uiPriority w:val="9"/>
     <w:qFormat/>
     <w:rsid w:val="002A1E46"/>
@@ -36292,15 +36265,15 @@
       <w:kern w:val="2"/>
       <w:sz w:val="40"/>
       <w:szCs w:val="40"/>
-      <w:lang w:val="en-NL"/>
+      <w:lang/>
       <w14:ligatures w14:val="standardContextual"/>
     </w:rPr>
   </w:style>
-  <w:style w:type="paragraph" w:styleId="Heading2">
+  <w:style w:type="paragraph" w:styleId="Kop2">
     <w:name w:val="heading 2"/>
-    <w:basedOn w:val="Normal"/>
-    <w:next w:val="Normal"/>
-    <w:link w:val="Heading2Char"/>
+    <w:basedOn w:val="Standaard"/>
+    <w:next w:val="Standaard"/>
+    <w:link w:val="Kop2Char"/>
     <w:uiPriority w:val="9"/>
     <w:semiHidden/>
     <w:unhideWhenUsed/>
@@ -36319,15 +36292,15 @@
       <w:kern w:val="2"/>
       <w:sz w:val="32"/>
       <w:szCs w:val="32"/>
-      <w:lang w:val="en-NL"/>
+      <w:lang/>
       <w14:ligatures w14:val="standardContextual"/>
     </w:rPr>
   </w:style>
-  <w:style w:type="paragraph" w:styleId="Heading3">
+  <w:style w:type="paragraph" w:styleId="Kop3">
     <w:name w:val="heading 3"/>
-    <w:basedOn w:val="Normal"/>
-    <w:next w:val="Normal"/>
-    <w:link w:val="Heading3Char"/>
+    <w:basedOn w:val="Standaard"/>
+    <w:next w:val="Standaard"/>
+    <w:link w:val="Kop3Char"/>
     <w:uiPriority w:val="9"/>
     <w:semiHidden/>
     <w:unhideWhenUsed/>
@@ -36346,15 +36319,15 @@
       <w:kern w:val="2"/>
       <w:sz w:val="28"/>
       <w:szCs w:val="28"/>
-      <w:lang w:val="en-NL"/>
+      <w:lang/>
       <w14:ligatures w14:val="standardContextual"/>
     </w:rPr>
   </w:style>
-  <w:style w:type="paragraph" w:styleId="Heading4">
+  <w:style w:type="paragraph" w:styleId="Kop4">
     <w:name w:val="heading 4"/>
-    <w:basedOn w:val="Normal"/>
-    <w:next w:val="Normal"/>
-    <w:link w:val="Heading4Char"/>
+    <w:basedOn w:val="Standaard"/>
+    <w:next w:val="Standaard"/>
+    <w:link w:val="Kop4Char"/>
     <w:uiPriority w:val="9"/>
     <w:semiHidden/>
     <w:unhideWhenUsed/>
@@ -36375,15 +36348,15 @@
       <w:kern w:val="2"/>
       <w:sz w:val="24"/>
       <w:szCs w:val="24"/>
-      <w:lang w:val="en-NL"/>
+      <w:lang/>
       <w14:ligatures w14:val="standardContextual"/>
     </w:rPr>
   </w:style>
-  <w:style w:type="paragraph" w:styleId="Heading5">
+  <w:style w:type="paragraph" w:styleId="Kop5">
     <w:name w:val="heading 5"/>
-    <w:basedOn w:val="Normal"/>
-    <w:next w:val="Normal"/>
-    <w:link w:val="Heading5Char"/>
+    <w:basedOn w:val="Standaard"/>
+    <w:next w:val="Standaard"/>
+    <w:link w:val="Kop5Char"/>
     <w:uiPriority w:val="9"/>
     <w:semiHidden/>
     <w:unhideWhenUsed/>
@@ -36402,15 +36375,15 @@
       <w:kern w:val="2"/>
       <w:sz w:val="24"/>
       <w:szCs w:val="24"/>
-      <w:lang w:val="en-NL"/>
+      <w:lang/>
       <w14:ligatures w14:val="standardContextual"/>
     </w:rPr>
   </w:style>
-  <w:style w:type="paragraph" w:styleId="Heading6">
+  <w:style w:type="paragraph" w:styleId="Kop6">
     <w:name w:val="heading 6"/>
-    <w:basedOn w:val="Normal"/>
-    <w:next w:val="Normal"/>
-    <w:link w:val="Heading6Char"/>
+    <w:basedOn w:val="Standaard"/>
+    <w:next w:val="Standaard"/>
+    <w:link w:val="Kop6Char"/>
     <w:uiPriority w:val="9"/>
     <w:semiHidden/>
     <w:unhideWhenUsed/>
@@ -36431,15 +36404,15 @@
       <w:kern w:val="2"/>
       <w:sz w:val="24"/>
       <w:szCs w:val="24"/>
-      <w:lang w:val="en-NL"/>
+      <w:lang/>
       <w14:ligatures w14:val="standardContextual"/>
     </w:rPr>
   </w:style>
-  <w:style w:type="paragraph" w:styleId="Heading7">
+  <w:style w:type="paragraph" w:styleId="Kop7">
     <w:name w:val="heading 7"/>
-    <w:basedOn w:val="Normal"/>
-    <w:next w:val="Normal"/>
-    <w:link w:val="Heading7Char"/>
+    <w:basedOn w:val="Standaard"/>
+    <w:next w:val="Standaard"/>
+    <w:link w:val="Kop7Char"/>
     <w:uiPriority w:val="9"/>
     <w:semiHidden/>
     <w:unhideWhenUsed/>
@@ -36458,15 +36431,15 @@
       <w:kern w:val="2"/>
       <w:sz w:val="24"/>
       <w:szCs w:val="24"/>
-      <w:lang w:val="en-NL"/>
+      <w:lang/>
       <w14:ligatures w14:val="standardContextual"/>
     </w:rPr>
   </w:style>
-  <w:style w:type="paragraph" w:styleId="Heading8">
+  <w:style w:type="paragraph" w:styleId="Kop8">
     <w:name w:val="heading 8"/>
-    <w:basedOn w:val="Normal"/>
-    <w:next w:val="Normal"/>
-    <w:link w:val="Heading8Char"/>
+    <w:basedOn w:val="Standaard"/>
+    <w:next w:val="Standaard"/>
+    <w:link w:val="Kop8Char"/>
     <w:uiPriority w:val="9"/>
     <w:semiHidden/>
     <w:unhideWhenUsed/>
@@ -36487,15 +36460,15 @@
       <w:kern w:val="2"/>
       <w:sz w:val="24"/>
       <w:szCs w:val="24"/>
-      <w:lang w:val="en-NL"/>
+      <w:lang/>
       <w14:ligatures w14:val="standardContextual"/>
     </w:rPr>
   </w:style>
-  <w:style w:type="paragraph" w:styleId="Heading9">
+  <w:style w:type="paragraph" w:styleId="Kop9">
     <w:name w:val="heading 9"/>
-    <w:basedOn w:val="Normal"/>
-    <w:next w:val="Normal"/>
-    <w:link w:val="Heading9Char"/>
+    <w:basedOn w:val="Standaard"/>
+    <w:next w:val="Standaard"/>
+    <w:link w:val="Kop9Char"/>
     <w:uiPriority w:val="9"/>
     <w:semiHidden/>
     <w:unhideWhenUsed/>
@@ -36514,17 +36487,17 @@
       <w:kern w:val="2"/>
       <w:sz w:val="24"/>
       <w:szCs w:val="24"/>
-      <w:lang w:val="en-NL"/>
+      <w:lang/>
       <w14:ligatures w14:val="standardContextual"/>
     </w:rPr>
   </w:style>
-  <w:style w:type="character" w:default="1" w:styleId="DefaultParagraphFont">
+  <w:style w:type="character" w:default="1" w:styleId="Standaardalinea-lettertype">
     <w:name w:val="Default Paragraph Font"/>
     <w:uiPriority w:val="1"/>
     <w:semiHidden/>
     <w:unhideWhenUsed/>
   </w:style>
-  <w:style w:type="table" w:default="1" w:styleId="TableNormal">
+  <w:style w:type="table" w:default="1" w:styleId="Standaardtabel">
     <w:name w:val="Normal Table"/>
     <w:uiPriority w:val="99"/>
     <w:semiHidden/>
@@ -36539,7 +36512,7 @@
       </w:tblCellMar>
     </w:tblPr>
   </w:style>
-  <w:style w:type="numbering" w:default="1" w:styleId="NoList">
+  <w:style w:type="numbering" w:default="1" w:styleId="Geenlijst">
     <w:name w:val="No List"/>
     <w:uiPriority w:val="99"/>
     <w:semiHidden/>
@@ -36547,7 +36520,7 @@
   </w:style>
   <w:style w:type="character" w:styleId="Hyperlink">
     <w:name w:val="Hyperlink"/>
-    <w:basedOn w:val="DefaultParagraphFont"/>
+    <w:basedOn w:val="Standaardalinea-lettertype"/>
     <w:uiPriority w:val="99"/>
     <w:unhideWhenUsed/>
     <w:rsid w:val="00C21FFA"/>
@@ -36556,10 +36529,10 @@
       <w:u w:val="single"/>
     </w:rPr>
   </w:style>
-  <w:style w:type="character" w:customStyle="1" w:styleId="Heading1Char">
-    <w:name w:val="Heading 1 Char"/>
-    <w:basedOn w:val="DefaultParagraphFont"/>
-    <w:link w:val="Heading1"/>
+  <w:style w:type="character" w:customStyle="1" w:styleId="Kop1Char">
+    <w:name w:val="Kop 1 Char"/>
+    <w:basedOn w:val="Standaardalinea-lettertype"/>
+    <w:link w:val="Kop1"/>
     <w:uiPriority w:val="9"/>
     <w:rsid w:val="002A1E46"/>
     <w:rPr>
@@ -36569,10 +36542,10 @@
       <w:szCs w:val="40"/>
     </w:rPr>
   </w:style>
-  <w:style w:type="character" w:customStyle="1" w:styleId="Heading2Char">
-    <w:name w:val="Heading 2 Char"/>
-    <w:basedOn w:val="DefaultParagraphFont"/>
-    <w:link w:val="Heading2"/>
+  <w:style w:type="character" w:customStyle="1" w:styleId="Kop2Char">
+    <w:name w:val="Kop 2 Char"/>
+    <w:basedOn w:val="Standaardalinea-lettertype"/>
+    <w:link w:val="Kop2"/>
     <w:uiPriority w:val="9"/>
     <w:semiHidden/>
     <w:rsid w:val="002A1E46"/>
@@ -36583,10 +36556,10 @@
       <w:szCs w:val="32"/>
     </w:rPr>
   </w:style>
-  <w:style w:type="character" w:customStyle="1" w:styleId="Heading3Char">
-    <w:name w:val="Heading 3 Char"/>
-    <w:basedOn w:val="DefaultParagraphFont"/>
-    <w:link w:val="Heading3"/>
+  <w:style w:type="character" w:customStyle="1" w:styleId="Kop3Char">
+    <w:name w:val="Kop 3 Char"/>
+    <w:basedOn w:val="Standaardalinea-lettertype"/>
+    <w:link w:val="Kop3"/>
     <w:uiPriority w:val="9"/>
     <w:semiHidden/>
     <w:rsid w:val="002A1E46"/>
@@ -36597,10 +36570,10 @@
       <w:szCs w:val="28"/>
     </w:rPr>
   </w:style>
-  <w:style w:type="character" w:customStyle="1" w:styleId="Heading4Char">
-    <w:name w:val="Heading 4 Char"/>
-    <w:basedOn w:val="DefaultParagraphFont"/>
-    <w:link w:val="Heading4"/>
+  <w:style w:type="character" w:customStyle="1" w:styleId="Kop4Char">
+    <w:name w:val="Kop 4 Char"/>
+    <w:basedOn w:val="Standaardalinea-lettertype"/>
+    <w:link w:val="Kop4"/>
     <w:uiPriority w:val="9"/>
     <w:semiHidden/>
     <w:rsid w:val="002A1E46"/>
@@ -36611,10 +36584,10 @@
       <w:color w:val="2F5496" w:themeColor="accent1" w:themeShade="BF"/>
     </w:rPr>
   </w:style>
-  <w:style w:type="character" w:customStyle="1" w:styleId="Heading5Char">
-    <w:name w:val="Heading 5 Char"/>
-    <w:basedOn w:val="DefaultParagraphFont"/>
-    <w:link w:val="Heading5"/>
+  <w:style w:type="character" w:customStyle="1" w:styleId="Kop5Char">
+    <w:name w:val="Kop 5 Char"/>
+    <w:basedOn w:val="Standaardalinea-lettertype"/>
+    <w:link w:val="Kop5"/>
     <w:uiPriority w:val="9"/>
     <w:semiHidden/>
     <w:rsid w:val="002A1E46"/>
@@ -36623,10 +36596,10 @@
       <w:color w:val="2F5496" w:themeColor="accent1" w:themeShade="BF"/>
     </w:rPr>
   </w:style>
-  <w:style w:type="character" w:customStyle="1" w:styleId="Heading6Char">
-    <w:name w:val="Heading 6 Char"/>
-    <w:basedOn w:val="DefaultParagraphFont"/>
-    <w:link w:val="Heading6"/>
+  <w:style w:type="character" w:customStyle="1" w:styleId="Kop6Char">
+    <w:name w:val="Kop 6 Char"/>
+    <w:basedOn w:val="Standaardalinea-lettertype"/>
+    <w:link w:val="Kop6"/>
     <w:uiPriority w:val="9"/>
     <w:semiHidden/>
     <w:rsid w:val="002A1E46"/>
@@ -36637,10 +36610,10 @@
       <w:color w:val="595959" w:themeColor="text1" w:themeTint="A6"/>
     </w:rPr>
   </w:style>
-  <w:style w:type="character" w:customStyle="1" w:styleId="Heading7Char">
-    <w:name w:val="Heading 7 Char"/>
-    <w:basedOn w:val="DefaultParagraphFont"/>
-    <w:link w:val="Heading7"/>
+  <w:style w:type="character" w:customStyle="1" w:styleId="Kop7Char">
+    <w:name w:val="Kop 7 Char"/>
+    <w:basedOn w:val="Standaardalinea-lettertype"/>
+    <w:link w:val="Kop7"/>
     <w:uiPriority w:val="9"/>
     <w:semiHidden/>
     <w:rsid w:val="002A1E46"/>
@@ -36649,10 +36622,10 @@
       <w:color w:val="595959" w:themeColor="text1" w:themeTint="A6"/>
     </w:rPr>
   </w:style>
-  <w:style w:type="character" w:customStyle="1" w:styleId="Heading8Char">
-    <w:name w:val="Heading 8 Char"/>
-    <w:basedOn w:val="DefaultParagraphFont"/>
-    <w:link w:val="Heading8"/>
+  <w:style w:type="character" w:customStyle="1" w:styleId="Kop8Char">
+    <w:name w:val="Kop 8 Char"/>
+    <w:basedOn w:val="Standaardalinea-lettertype"/>
+    <w:link w:val="Kop8"/>
     <w:uiPriority w:val="9"/>
     <w:semiHidden/>
     <w:rsid w:val="002A1E46"/>
@@ -36663,10 +36636,10 @@
       <w:color w:val="272727" w:themeColor="text1" w:themeTint="D8"/>
     </w:rPr>
   </w:style>
-  <w:style w:type="character" w:customStyle="1" w:styleId="Heading9Char">
-    <w:name w:val="Heading 9 Char"/>
-    <w:basedOn w:val="DefaultParagraphFont"/>
-    <w:link w:val="Heading9"/>
+  <w:style w:type="character" w:customStyle="1" w:styleId="Kop9Char">
+    <w:name w:val="Kop 9 Char"/>
+    <w:basedOn w:val="Standaardalinea-lettertype"/>
+    <w:link w:val="Kop9"/>
     <w:uiPriority w:val="9"/>
     <w:semiHidden/>
     <w:rsid w:val="002A1E46"/>
@@ -36675,11 +36648,11 @@
       <w:color w:val="272727" w:themeColor="text1" w:themeTint="D8"/>
     </w:rPr>
   </w:style>
-  <w:style w:type="paragraph" w:styleId="Title">
+  <w:style w:type="paragraph" w:styleId="Titel">
     <w:name w:val="Title"/>
-    <w:basedOn w:val="Normal"/>
-    <w:next w:val="Normal"/>
-    <w:link w:val="TitleChar"/>
+    <w:basedOn w:val="Standaard"/>
+    <w:next w:val="Standaard"/>
+    <w:link w:val="TitelChar"/>
     <w:uiPriority w:val="10"/>
     <w:qFormat/>
     <w:rsid w:val="002A1E46"/>
@@ -36694,14 +36667,14 @@
       <w:kern w:val="28"/>
       <w:sz w:val="56"/>
       <w:szCs w:val="56"/>
-      <w:lang w:val="en-NL"/>
+      <w:lang/>
       <w14:ligatures w14:val="standardContextual"/>
     </w:rPr>
   </w:style>
-  <w:style w:type="character" w:customStyle="1" w:styleId="TitleChar">
-    <w:name w:val="Title Char"/>
-    <w:basedOn w:val="DefaultParagraphFont"/>
-    <w:link w:val="Title"/>
+  <w:style w:type="character" w:customStyle="1" w:styleId="TitelChar">
+    <w:name w:val="Titel Char"/>
+    <w:basedOn w:val="Standaardalinea-lettertype"/>
+    <w:link w:val="Titel"/>
     <w:uiPriority w:val="10"/>
     <w:rsid w:val="002A1E46"/>
     <w:rPr>
@@ -36712,11 +36685,11 @@
       <w:szCs w:val="56"/>
     </w:rPr>
   </w:style>
-  <w:style w:type="paragraph" w:styleId="Subtitle">
+  <w:style w:type="paragraph" w:styleId="Ondertitel">
     <w:name w:val="Subtitle"/>
-    <w:basedOn w:val="Normal"/>
-    <w:next w:val="Normal"/>
-    <w:link w:val="SubtitleChar"/>
+    <w:basedOn w:val="Standaard"/>
+    <w:next w:val="Standaard"/>
+    <w:link w:val="OndertitelChar"/>
     <w:uiPriority w:val="11"/>
     <w:qFormat/>
     <w:rsid w:val="002A1E46"/>
@@ -36734,14 +36707,14 @@
       <w:kern w:val="2"/>
       <w:sz w:val="28"/>
       <w:szCs w:val="28"/>
-      <w:lang w:val="en-NL"/>
+      <w:lang/>
       <w14:ligatures w14:val="standardContextual"/>
     </w:rPr>
   </w:style>
-  <w:style w:type="character" w:customStyle="1" w:styleId="SubtitleChar">
-    <w:name w:val="Subtitle Char"/>
-    <w:basedOn w:val="DefaultParagraphFont"/>
-    <w:link w:val="Subtitle"/>
+  <w:style w:type="character" w:customStyle="1" w:styleId="OndertitelChar">
+    <w:name w:val="Ondertitel Char"/>
+    <w:basedOn w:val="Standaardalinea-lettertype"/>
+    <w:link w:val="Ondertitel"/>
     <w:uiPriority w:val="11"/>
     <w:rsid w:val="002A1E46"/>
     <w:rPr>
@@ -36752,11 +36725,11 @@
       <w:szCs w:val="28"/>
     </w:rPr>
   </w:style>
-  <w:style w:type="paragraph" w:styleId="Quote">
+  <w:style w:type="paragraph" w:styleId="Citaat">
     <w:name w:val="Quote"/>
-    <w:basedOn w:val="Normal"/>
-    <w:next w:val="Normal"/>
-    <w:link w:val="QuoteChar"/>
+    <w:basedOn w:val="Standaard"/>
+    <w:next w:val="Standaard"/>
+    <w:link w:val="CitaatChar"/>
     <w:uiPriority w:val="29"/>
     <w:qFormat/>
     <w:rsid w:val="002A1E46"/>
@@ -36772,14 +36745,14 @@
       <w:kern w:val="2"/>
       <w:sz w:val="24"/>
       <w:szCs w:val="24"/>
-      <w:lang w:val="en-NL"/>
+      <w:lang/>
       <w14:ligatures w14:val="standardContextual"/>
     </w:rPr>
   </w:style>
-  <w:style w:type="character" w:customStyle="1" w:styleId="QuoteChar">
-    <w:name w:val="Quote Char"/>
-    <w:basedOn w:val="DefaultParagraphFont"/>
-    <w:link w:val="Quote"/>
+  <w:style w:type="character" w:customStyle="1" w:styleId="CitaatChar">
+    <w:name w:val="Citaat Char"/>
+    <w:basedOn w:val="Standaardalinea-lettertype"/>
+    <w:link w:val="Citaat"/>
     <w:uiPriority w:val="29"/>
     <w:rsid w:val="002A1E46"/>
     <w:rPr>
@@ -36788,9 +36761,9 @@
       <w:color w:val="404040" w:themeColor="text1" w:themeTint="BF"/>
     </w:rPr>
   </w:style>
-  <w:style w:type="paragraph" w:styleId="ListParagraph">
+  <w:style w:type="paragraph" w:styleId="Lijstalinea">
     <w:name w:val="List Paragraph"/>
-    <w:basedOn w:val="Normal"/>
+    <w:basedOn w:val="Standaard"/>
     <w:uiPriority w:val="34"/>
     <w:qFormat/>
     <w:rsid w:val="002A1E46"/>
@@ -36804,13 +36777,13 @@
       <w:kern w:val="2"/>
       <w:sz w:val="24"/>
       <w:szCs w:val="24"/>
-      <w:lang w:val="en-NL"/>
+      <w:lang/>
       <w14:ligatures w14:val="standardContextual"/>
     </w:rPr>
   </w:style>
-  <w:style w:type="character" w:styleId="IntenseEmphasis">
+  <w:style w:type="character" w:styleId="Intensievebenadrukking">
     <w:name w:val="Intense Emphasis"/>
-    <w:basedOn w:val="DefaultParagraphFont"/>
+    <w:basedOn w:val="Standaardalinea-lettertype"/>
     <w:uiPriority w:val="21"/>
     <w:qFormat/>
     <w:rsid w:val="002A1E46"/>
@@ -36820,11 +36793,11 @@
       <w:color w:val="2F5496" w:themeColor="accent1" w:themeShade="BF"/>
     </w:rPr>
   </w:style>
-  <w:style w:type="paragraph" w:styleId="IntenseQuote">
+  <w:style w:type="paragraph" w:styleId="Duidelijkcitaat">
     <w:name w:val="Intense Quote"/>
-    <w:basedOn w:val="Normal"/>
-    <w:next w:val="Normal"/>
-    <w:link w:val="IntenseQuoteChar"/>
+    <w:basedOn w:val="Standaard"/>
+    <w:next w:val="Standaard"/>
+    <w:link w:val="DuidelijkcitaatChar"/>
     <w:uiPriority w:val="30"/>
     <w:qFormat/>
     <w:rsid w:val="002A1E46"/>
@@ -36845,14 +36818,14 @@
       <w:kern w:val="2"/>
       <w:sz w:val="24"/>
       <w:szCs w:val="24"/>
-      <w:lang w:val="en-NL"/>
+      <w:lang/>
       <w14:ligatures w14:val="standardContextual"/>
     </w:rPr>
   </w:style>
-  <w:style w:type="character" w:customStyle="1" w:styleId="IntenseQuoteChar">
-    <w:name w:val="Intense Quote Char"/>
-    <w:basedOn w:val="DefaultParagraphFont"/>
-    <w:link w:val="IntenseQuote"/>
+  <w:style w:type="character" w:customStyle="1" w:styleId="DuidelijkcitaatChar">
+    <w:name w:val="Duidelijk citaat Char"/>
+    <w:basedOn w:val="Standaardalinea-lettertype"/>
+    <w:link w:val="Duidelijkcitaat"/>
     <w:uiPriority w:val="30"/>
     <w:rsid w:val="002A1E46"/>
     <w:rPr>
@@ -36861,9 +36834,9 @@
       <w:color w:val="2F5496" w:themeColor="accent1" w:themeShade="BF"/>
     </w:rPr>
   </w:style>
-  <w:style w:type="character" w:styleId="IntenseReference">
+  <w:style w:type="character" w:styleId="Intensieveverwijzing">
     <w:name w:val="Intense Reference"/>
-    <w:basedOn w:val="DefaultParagraphFont"/>
+    <w:basedOn w:val="Standaardalinea-lettertype"/>
     <w:uiPriority w:val="32"/>
     <w:qFormat/>
     <w:rsid w:val="002A1E46"/>
@@ -36877,8 +36850,8 @@
   </w:style>
   <w:style w:type="paragraph" w:customStyle="1" w:styleId="Heading">
     <w:name w:val="Heading"/>
-    <w:basedOn w:val="Normal"/>
-    <w:next w:val="BodyText"/>
+    <w:basedOn w:val="Standaard"/>
+    <w:next w:val="Plattetekst"/>
     <w:qFormat/>
     <w:rsid w:val="002A1E46"/>
     <w:pPr>
@@ -36891,19 +36864,19 @@
       <w:szCs w:val="28"/>
     </w:rPr>
   </w:style>
-  <w:style w:type="paragraph" w:styleId="BodyText">
+  <w:style w:type="paragraph" w:styleId="Plattetekst">
     <w:name w:val="Body Text"/>
-    <w:basedOn w:val="Normal"/>
-    <w:link w:val="BodyTextChar"/>
+    <w:basedOn w:val="Standaard"/>
+    <w:link w:val="PlattetekstChar"/>
     <w:rsid w:val="002A1E46"/>
     <w:pPr>
       <w:spacing w:after="140" w:line="276" w:lineRule="auto"/>
     </w:pPr>
   </w:style>
-  <w:style w:type="character" w:customStyle="1" w:styleId="BodyTextChar">
-    <w:name w:val="Body Text Char"/>
-    <w:basedOn w:val="DefaultParagraphFont"/>
-    <w:link w:val="BodyText"/>
+  <w:style w:type="character" w:customStyle="1" w:styleId="PlattetekstChar">
+    <w:name w:val="Platte tekst Char"/>
+    <w:basedOn w:val="Standaardalinea-lettertype"/>
+    <w:link w:val="Plattetekst"/>
     <w:rsid w:val="002A1E46"/>
     <w:rPr>
       <w:kern w:val="0"/>
@@ -36913,17 +36886,17 @@
       <w14:ligatures w14:val="none"/>
     </w:rPr>
   </w:style>
-  <w:style w:type="paragraph" w:styleId="List">
+  <w:style w:type="paragraph" w:styleId="Lijst">
     <w:name w:val="List"/>
-    <w:basedOn w:val="BodyText"/>
+    <w:basedOn w:val="Plattetekst"/>
     <w:rsid w:val="002A1E46"/>
     <w:rPr>
       <w:rFonts w:cs="Noto Sans"/>
     </w:rPr>
   </w:style>
-  <w:style w:type="paragraph" w:styleId="Caption">
+  <w:style w:type="paragraph" w:styleId="Bijschrift">
     <w:name w:val="caption"/>
-    <w:basedOn w:val="Normal"/>
+    <w:basedOn w:val="Standaard"/>
     <w:qFormat/>
     <w:rsid w:val="002A1E46"/>
     <w:pPr>
@@ -36940,7 +36913,7 @@
   </w:style>
   <w:style w:type="paragraph" w:customStyle="1" w:styleId="Index">
     <w:name w:val="Index"/>
-    <w:basedOn w:val="Normal"/>
+    <w:basedOn w:val="Standaard"/>
     <w:qFormat/>
     <w:rsid w:val="002A1E46"/>
     <w:pPr>
@@ -36950,10 +36923,10 @@
       <w:rFonts w:cs="Noto Sans"/>
     </w:rPr>
   </w:style>
-  <w:style w:type="paragraph" w:styleId="FootnoteText">
+  <w:style w:type="paragraph" w:styleId="Voetnoottekst">
     <w:name w:val="footnote text"/>
-    <w:basedOn w:val="Normal"/>
-    <w:link w:val="FootnoteTextChar"/>
+    <w:basedOn w:val="Standaard"/>
+    <w:link w:val="VoetnoottekstChar"/>
     <w:uiPriority w:val="99"/>
     <w:semiHidden/>
     <w:unhideWhenUsed/>
@@ -36966,10 +36939,10 @@
       <w:szCs w:val="20"/>
     </w:rPr>
   </w:style>
-  <w:style w:type="character" w:customStyle="1" w:styleId="FootnoteTextChar">
-    <w:name w:val="Footnote Text Char"/>
-    <w:basedOn w:val="DefaultParagraphFont"/>
-    <w:link w:val="FootnoteText"/>
+  <w:style w:type="character" w:customStyle="1" w:styleId="VoetnoottekstChar">
+    <w:name w:val="Voetnoottekst Char"/>
+    <w:basedOn w:val="Standaardalinea-lettertype"/>
+    <w:link w:val="Voetnoottekst"/>
     <w:uiPriority w:val="99"/>
     <w:semiHidden/>
     <w:rsid w:val="002A1E46"/>
@@ -36981,9 +36954,9 @@
       <w14:ligatures w14:val="none"/>
     </w:rPr>
   </w:style>
-  <w:style w:type="character" w:styleId="FootnoteReference">
+  <w:style w:type="character" w:styleId="Voetnootmarkering">
     <w:name w:val="footnote reference"/>
-    <w:basedOn w:val="DefaultParagraphFont"/>
+    <w:basedOn w:val="Standaardalinea-lettertype"/>
     <w:uiPriority w:val="99"/>
     <w:semiHidden/>
     <w:unhideWhenUsed/>

</xml_diff>